<commit_message>
cerrar hallazgos de auditoria de seguridad
</commit_message>
<xml_diff>
--- a/docs/actividad-8/Actividad_8_Fundamentos_Pruebas_Samuel_Escobar.docx
+++ b/docs/actividad-8/Actividad_8_Fundamentos_Pruebas_Samuel_Escobar.docx
@@ -2259,7 +2259,7 @@
                 <w:sz w:val="20"/>
                 <w:szCs w:val="20"/>
               </w:rPr>
-              <w:t xml:space="preserve">Pruebas de seguridad nuevas</w:t>
+              <w:t xml:space="preserve">Controles de endurecimiento</w:t>
             </w:r>
           </w:p>
         </w:tc>
@@ -2296,7 +2296,7 @@
                 <w:sz w:val="20"/>
                 <w:szCs w:val="20"/>
               </w:rPr>
-              <w:t xml:space="preserve">3 de 3 superadas</w:t>
+              <w:t xml:space="preserve">5 de 5 superados</w:t>
             </w:r>
           </w:p>
         </w:tc>
@@ -2374,7 +2374,7 @@
                 <w:sz w:val="20"/>
                 <w:szCs w:val="20"/>
               </w:rPr>
-              <w:t xml:space="preserve">403 de 403 superadas</w:t>
+              <w:t xml:space="preserve">408 de 408 superadas</w:t>
             </w:r>
           </w:p>
         </w:tc>

</xml_diff>